<commit_message>
Hide resume links behind anchor text and regenerate single-page PDF and DOCX
</commit_message>
<xml_diff>
--- a/assets/Henry_Fadeni_Applied_AI_Software_Engineer.docx
+++ b/assets/Henry_Fadeni_Applied_AI_Software_Engineer.docx
@@ -40,16 +40,68 @@
           <w:color w:val="475569"/>
           <w:sz w:val="16"/>
         </w:rPr>
-        <w:t>Lagos, Nigeria (Remote / Relocation)  •  +234 706 616 1980  •  hfadeni@gmail.com</w:t>
+        <w:t xml:space="preserve">Lagos, Nigeria (Remote / Relocation)  •  +234 706 616 1980  •  </w:t>
+      </w:r>
+      <w:hyperlink r:id="rId9">
+        <w:r>
+          <w:rPr>
+            <w:rFonts w:ascii="Calibri" w:hAnsi="Calibri"/>
+            <w:sz w:val="16"/>
+            <w:color w:val="2563EB"/>
+          </w:rPr>
+          <w:t>hfadeni@gmail.com</w:t>
+        </w:r>
+      </w:hyperlink>
+      <w:r>
+        <w:rPr>
+          <w:sz w:val="16"/>
+        </w:rPr>
         <w:br/>
       </w:r>
+      <w:hyperlink r:id="rId10">
+        <w:r>
+          <w:rPr>
+            <w:rFonts w:ascii="Calibri" w:hAnsi="Calibri"/>
+            <w:sz w:val="16"/>
+            <w:color w:val="2563EB"/>
+          </w:rPr>
+          <w:t>Portfolio</w:t>
+        </w:r>
+      </w:hyperlink>
       <w:r>
         <w:rPr>
-          <w:color w:val="2563EB"/>
+          <w:color w:val="475569"/>
           <w:sz w:val="16"/>
         </w:rPr>
-        <w:t>Portfolio: henryfadeni.vercel.app  •  GitHub: github.com/Protagonist01  •  LinkedIn: linkedin.com/in/henry-fadeni-ai-engineer</w:t>
+        <w:t xml:space="preserve">  •  </w:t>
       </w:r>
+      <w:hyperlink r:id="rId11">
+        <w:r>
+          <w:rPr>
+            <w:rFonts w:ascii="Calibri" w:hAnsi="Calibri"/>
+            <w:sz w:val="16"/>
+            <w:color w:val="2563EB"/>
+          </w:rPr>
+          <w:t>GitHub</w:t>
+        </w:r>
+      </w:hyperlink>
+      <w:r>
+        <w:rPr>
+          <w:color w:val="475569"/>
+          <w:sz w:val="16"/>
+        </w:rPr>
+        <w:t xml:space="preserve">  •  </w:t>
+      </w:r>
+      <w:hyperlink r:id="rId12">
+        <w:r>
+          <w:rPr>
+            <w:rFonts w:ascii="Calibri" w:hAnsi="Calibri"/>
+            <w:sz w:val="16"/>
+            <w:color w:val="2563EB"/>
+          </w:rPr>
+          <w:t>LinkedIn</w:t>
+        </w:r>
+      </w:hyperlink>
     </w:p>
     <w:p>
       <w:pPr>

</xml_diff>

<commit_message>
Update Student Research Assistant dates to 2023-2025 and reorder projects by year
</commit_message>
<xml_diff>
--- a/assets/Henry_Fadeni_Applied_AI_Software_Engineer.docx
+++ b/assets/Henry_Fadeni_Applied_AI_Software_Engineer.docx
@@ -424,119 +424,6 @@
                 <w:color w:val="0F172A"/>
                 <w:sz w:val="17"/>
               </w:rPr>
-              <w:t>Autonomous Code Review Agent (GitHub App)</w:t>
-            </w:r>
-            <w:r>
-              <w:rPr>
-                <w:i/>
-                <w:color w:val="475569"/>
-                <w:sz w:val="16"/>
-              </w:rPr>
-              <w:t xml:space="preserve"> | Python · FastAPI · LangGraph · Celery · Redis · Docker</w:t>
-            </w:r>
-          </w:p>
-        </w:tc>
-        <w:tc>
-          <w:tcPr>
-            <w:tcW w:type="dxa" w:w="5400"/>
-            <w:tcMar>
-              <w:top w:w="0" w:type="dxa"/>
-              <w:bottom w:w="0" w:type="dxa"/>
-              <w:left w:w="0" w:type="dxa"/>
-              <w:right w:w="0" w:type="dxa"/>
-            </w:tcMar>
-          </w:tcPr>
-          <w:p>
-            <w:pPr>
-              <w:spacing w:before="70" w:after="10"/>
-              <w:jc w:val="right"/>
-            </w:pPr>
-            <w:r>
-              <w:rPr>
-                <w:b/>
-                <w:color w:val="0F172A"/>
-                <w:sz w:val="16"/>
-              </w:rPr>
-              <w:t>2025</w:t>
-            </w:r>
-          </w:p>
-        </w:tc>
-      </w:tr>
-    </w:tbl>
-    <w:p>
-      <w:pPr>
-        <w:pStyle w:val="ListBullet"/>
-        <w:spacing w:before="0" w:after="24" w:line="259" w:lineRule="auto"/>
-        <w:ind w:left="259"/>
-      </w:pPr>
-      <w:r>
-        <w:rPr>
-          <w:color w:val="334155"/>
-          <w:sz w:val="16"/>
-        </w:rPr>
-        <w:t>Event-driven GitHub App agent that parses pull-request diffs, retrieves relevant file context, and publishes line-level inline reviews and commit statuses.</w:t>
-      </w:r>
-    </w:p>
-    <w:p>
-      <w:pPr>
-        <w:pStyle w:val="ListBullet"/>
-        <w:spacing w:before="0" w:after="24" w:line="259" w:lineRule="auto"/>
-        <w:ind w:left="259"/>
-      </w:pPr>
-      <w:r>
-        <w:rPr>
-          <w:color w:val="334155"/>
-          <w:sz w:val="16"/>
-        </w:rPr>
-        <w:t>Decoupled webhook intake from model inference using Celery workers for asynchronous job queuing, with HMAC-SHA256 webhook verification and Redis sliding-window rate limiting.</w:t>
-      </w:r>
-    </w:p>
-    <w:p>
-      <w:pPr>
-        <w:pStyle w:val="ListBullet"/>
-        <w:spacing w:before="0" w:after="24" w:line="259" w:lineRule="auto"/>
-        <w:ind w:left="259"/>
-      </w:pPr>
-      <w:r>
-        <w:rPr>
-          <w:color w:val="334155"/>
-          <w:sz w:val="16"/>
-        </w:rPr>
-        <w:t>Built a pluggable multi-provider LLM abstraction (OpenAI, Anthropic, Groq, Ollama) behind an 80% CI code coverage gate.</w:t>
-      </w:r>
-    </w:p>
-    <w:tbl>
-      <w:tblPr>
-        <w:tblW w:type="auto" w:w="0"/>
-        <w:jc w:val="center"/>
-        <w:tblLayout w:type="fixed"/>
-        <w:tblLook w:firstColumn="1" w:firstRow="1" w:lastColumn="0" w:lastRow="0" w:noHBand="0" w:noVBand="1" w:val="04A0"/>
-      </w:tblPr>
-      <w:tblGrid>
-        <w:gridCol w:w="8352"/>
-        <w:gridCol w:w="2448"/>
-      </w:tblGrid>
-      <w:tr>
-        <w:tc>
-          <w:tcPr>
-            <w:tcW w:type="dxa" w:w="5400"/>
-            <w:tcMar>
-              <w:top w:w="0" w:type="dxa"/>
-              <w:bottom w:w="0" w:type="dxa"/>
-              <w:left w:w="0" w:type="dxa"/>
-              <w:right w:w="0" w:type="dxa"/>
-            </w:tcMar>
-          </w:tcPr>
-          <w:p>
-            <w:pPr>
-              <w:spacing w:before="70" w:after="10"/>
-            </w:pPr>
-            <w:r>
-              <w:rPr>
-                <w:b/>
-                <w:color w:val="0F172A"/>
-                <w:sz w:val="17"/>
-              </w:rPr>
               <w:t>Self-Healing Microservices Monitor (Autonomous SRE Agent)</w:t>
             </w:r>
             <w:r>
@@ -715,6 +602,119 @@
           <w:sz w:val="16"/>
         </w:rPr>
         <w:t>JWT authentication at handshake, Redis-hash presence tracking with multi-device deduplication, and cursor-paginated message history (15 msgs/page); verified by cross-process integration tests for multi-worker delivery and connection fault isolation.</w:t>
+      </w:r>
+    </w:p>
+    <w:tbl>
+      <w:tblPr>
+        <w:tblW w:type="auto" w:w="0"/>
+        <w:jc w:val="center"/>
+        <w:tblLayout w:type="fixed"/>
+        <w:tblLook w:firstColumn="1" w:firstRow="1" w:lastColumn="0" w:lastRow="0" w:noHBand="0" w:noVBand="1" w:val="04A0"/>
+      </w:tblPr>
+      <w:tblGrid>
+        <w:gridCol w:w="8352"/>
+        <w:gridCol w:w="2448"/>
+      </w:tblGrid>
+      <w:tr>
+        <w:tc>
+          <w:tcPr>
+            <w:tcW w:type="dxa" w:w="5400"/>
+            <w:tcMar>
+              <w:top w:w="0" w:type="dxa"/>
+              <w:bottom w:w="0" w:type="dxa"/>
+              <w:left w:w="0" w:type="dxa"/>
+              <w:right w:w="0" w:type="dxa"/>
+            </w:tcMar>
+          </w:tcPr>
+          <w:p>
+            <w:pPr>
+              <w:spacing w:before="70" w:after="10"/>
+            </w:pPr>
+            <w:r>
+              <w:rPr>
+                <w:b/>
+                <w:color w:val="0F172A"/>
+                <w:sz w:val="17"/>
+              </w:rPr>
+              <w:t>Autonomous Code Review Agent (GitHub App)</w:t>
+            </w:r>
+            <w:r>
+              <w:rPr>
+                <w:i/>
+                <w:color w:val="475569"/>
+                <w:sz w:val="16"/>
+              </w:rPr>
+              <w:t xml:space="preserve"> | Python · FastAPI · LangGraph · Celery · Redis · Docker</w:t>
+            </w:r>
+          </w:p>
+        </w:tc>
+        <w:tc>
+          <w:tcPr>
+            <w:tcW w:type="dxa" w:w="5400"/>
+            <w:tcMar>
+              <w:top w:w="0" w:type="dxa"/>
+              <w:bottom w:w="0" w:type="dxa"/>
+              <w:left w:w="0" w:type="dxa"/>
+              <w:right w:w="0" w:type="dxa"/>
+            </w:tcMar>
+          </w:tcPr>
+          <w:p>
+            <w:pPr>
+              <w:spacing w:before="70" w:after="10"/>
+              <w:jc w:val="right"/>
+            </w:pPr>
+            <w:r>
+              <w:rPr>
+                <w:b/>
+                <w:color w:val="0F172A"/>
+                <w:sz w:val="16"/>
+              </w:rPr>
+              <w:t>2025</w:t>
+            </w:r>
+          </w:p>
+        </w:tc>
+      </w:tr>
+    </w:tbl>
+    <w:p>
+      <w:pPr>
+        <w:pStyle w:val="ListBullet"/>
+        <w:spacing w:before="0" w:after="24" w:line="259" w:lineRule="auto"/>
+        <w:ind w:left="259"/>
+      </w:pPr>
+      <w:r>
+        <w:rPr>
+          <w:color w:val="334155"/>
+          <w:sz w:val="16"/>
+        </w:rPr>
+        <w:t>Event-driven GitHub App agent that parses pull-request diffs, retrieves relevant file context, and publishes line-level inline reviews and commit statuses.</w:t>
+      </w:r>
+    </w:p>
+    <w:p>
+      <w:pPr>
+        <w:pStyle w:val="ListBullet"/>
+        <w:spacing w:before="0" w:after="24" w:line="259" w:lineRule="auto"/>
+        <w:ind w:left="259"/>
+      </w:pPr>
+      <w:r>
+        <w:rPr>
+          <w:color w:val="334155"/>
+          <w:sz w:val="16"/>
+        </w:rPr>
+        <w:t>Decoupled webhook intake from model inference using Celery workers for asynchronous job queuing, with HMAC-SHA256 webhook verification and Redis sliding-window rate limiting.</w:t>
+      </w:r>
+    </w:p>
+    <w:p>
+      <w:pPr>
+        <w:pStyle w:val="ListBullet"/>
+        <w:spacing w:before="0" w:after="24" w:line="259" w:lineRule="auto"/>
+        <w:ind w:left="259"/>
+      </w:pPr>
+      <w:r>
+        <w:rPr>
+          <w:color w:val="334155"/>
+          <w:sz w:val="16"/>
+        </w:rPr>
+        <w:t>Built a pluggable multi-provider LLM abstraction (OpenAI, Anthropic, Groq, Ollama) behind an 80% CI code coverage gate.</w:t>
       </w:r>
     </w:p>
     <w:p>
@@ -1009,7 +1009,7 @@
                 <w:color w:val="0F172A"/>
                 <w:sz w:val="16"/>
               </w:rPr>
-              <w:t>2020 – 2025</w:t>
+              <w:t>2023 – 2025</w:t>
             </w:r>
             <w:r>
               <w:rPr>

</xml_diff>